<commit_message>
Remove unused GPU hardware references
</commit_message>
<xml_diff>
--- a/final/Marianovskiy_VKR_ADAS_final.docx
+++ b/final/Marianovskiy_VKR_ADAS_final.docx
@@ -2704,7 +2704,7 @@
           <w:b w:val="0"/>
           <w:sz w:val="28"/>
         </w:rPr>
-        <w:t>Границы исследования заданы доступными данными и вычислительными ресурсами. Основной эксперимент выполнен на реальных аннотациях KITTI [5, 6], но без обучения нейросетевой модели по сырым изображениям и облакам точек. Доступная видеокарта AMD Radeon RX 7700 XT может применяться в будущей работе с raw sensor pipeline, однако текущая модель является табличной и воспроизводимо обучается на CPU.</w:t>
+        <w:t>Границы исследования заданы доступными данными и вычислительными ресурсами. Основной эксперимент выполнен на реальных аннотациях KITTI [5, 6], но без обучения нейросетевой модели по сырым изображениям и облакам точек. Текущая модель является табличной и воспроизводимо обучается на CPU; raw sensor pipeline относится к следующему, отдельному этапу исследования.</w:t>
       </w:r>
     </w:p>
     <w:p>
@@ -4271,7 +4271,7 @@
           <w:b w:val="0"/>
           <w:sz w:val="28"/>
         </w:rPr>
-        <w:t>Для будущего расширения доступная GPU RX 7700 XT может использоваться при обучении моделей на изображениях и облаках точек через совместимый backend. В финальных метриках текущей работы GPU не играет роли, потому что обучение выполнено для табличной scenario-level модели.</w:t>
+        <w:t>Будущее расширение с обучением моделей на изображениях и облаках точек потребует отдельного backend и отдельной проверки вычислительного контура. В финальных метриках текущей работы этот будущий контур не участвует, потому что обучение выполнено для табличной scenario-level модели.</w:t>
       </w:r>
     </w:p>
     <w:p>
@@ -5901,7 +5901,7 @@
           <w:b w:val="0"/>
           <w:sz w:val="28"/>
         </w:rPr>
-        <w:t>Основной стек намеренно оставлен компактным. Python и NumPy используются для подготовки данных, обучения logistic regression и расчета метрик. Matplotlib строит графики, Microsoft Word и инструменты презентаций формируют финальные материалы.</w:t>
+        <w:t>Основной стек намеренно оставлен компактным. Python и NumPy используются для подготовки данных, обучения logistic regression и расчета метрик. Matplotlib строит графики, python-docx и инструменты презентаций формируют финальные материалы.</w:t>
       </w:r>
     </w:p>
     <w:p>
@@ -5915,7 +5915,7 @@
           <w:b w:val="0"/>
           <w:sz w:val="28"/>
         </w:rPr>
-        <w:t>Текущий эксперимент не требует GPU, потому что модель обучается на табличных признаках scenario-level. Это не противоречит наличию RX 7700 XT на рабочем компьютере. Видеокарта полезна для будущей версии с raw image, LiDAR и radar pipeline, но не должна смешиваться с уже полученными метриками.</w:t>
+        <w:t>Текущий эксперимент выполняется в CPU-friendly контуре, потому что модель обучается на табличных признаках scenario-level. Будущая версия с raw image, LiDAR и radar pipeline потребует отдельного вычислительного контура и не должна смешиваться с уже полученными метриками.</w:t>
       </w:r>
     </w:p>
     <w:p>
@@ -6455,7 +6455,7 @@
           <w:b w:val="0"/>
           <w:sz w:val="28"/>
         </w:rPr>
-        <w:t>RX 7700 XT может использоваться как локальный ресурс для будущего обучения, если выбранный backend поддерживает рабочий стек на Windows. В тексте ВКР этот ресурс не должен выглядеть как причина уже полученных результатов.</w:t>
+        <w:t>Будущий raw sensor контур потребует отдельного выбора backend, проверки совместимости на Windows и независимого расчета метрик. В тексте ВКР этот этап не должен выглядеть как часть уже полученных результатов.</w:t>
       </w:r>
     </w:p>
     <w:p>
@@ -6897,7 +6897,7 @@
           <w:b w:val="0"/>
           <w:sz w:val="28"/>
         </w:rPr>
-        <w:t>RX 7700 XT полезна как локальный ресурс для будущих моделей, но текущие метрики не зависят от GPU. Такое разделение важно для честности: наличие видеокарты не должно создавать впечатление, что в ВКР уже обучена тяжелая нейросетевая модель.</w:t>
+        <w:t>Текущие метрики не зависят от будущего raw sensor контура. Такое разделение важно для честности: описание будущего pipeline не должно создавать впечатление, что в ВКР уже обучена тяжелая нейросетевая модель.</w:t>
       </w:r>
     </w:p>
     <w:p>
@@ -6967,7 +6967,7 @@
           <w:b w:val="0"/>
           <w:sz w:val="28"/>
         </w:rPr>
-        <w:t>GPU RX 7700 XT может помочь при обучении или инференсе более тяжелых моделей, но выбор backend на Windows нужно проверять отдельно. Нельзя переносить текущие CPU-метрики на будущую нейросетевую архитектуру.</w:t>
+        <w:t>Для обучения или инференса более тяжелых моделей нужно отдельно подбирать вычислительный backend и проверять его на Windows. Нельзя переносить текущие CPU-метрики на будущую нейросетевую архитектуру.</w:t>
       </w:r>
     </w:p>
     <w:p>
@@ -8941,7 +8941,7 @@
           <w:b w:val="0"/>
           <w:sz w:val="28"/>
         </w:rPr>
-        <w:t>Разработанный прототип может применяться как исследовательский модуль тестирования ADAS. Он помогает выделять сцены, где восприятие требует осторожной обработки, повторной проверки или расширения обучающего набора. Дальнейшее развитие включает raw image и LiDAR pipeline, подключение radar, проверку на nuScenes и CARLA, а также использование доступной AMD Radeon RX 7700 XT через совместимый backend.</w:t>
+        <w:t>Разработанный прототип может применяться как исследовательский модуль тестирования ADAS. Он помогает выделять сцены, где восприятие требует осторожной обработки, повторной проверки или расширения обучающего набора. Дальнейшее развитие включает raw image и LiDAR pipeline, подключение radar, проверку на nuScenes и CARLA, а также отдельный выбор вычислительного backend для более тяжелых моделей.</w:t>
       </w:r>
     </w:p>
     <w:p>

</xml_diff>